<commit_message>
docs: consolidate Bilim OS sales kit into PDFs
Replace scattered .docx (onboarding, demo script, concept, sales script,
competitor comparison, cheat sheet) with consolidated PDF deliverables
(guide, KP) generated via updated generators. Add make-bilim-pdf.mjs.

Co-Authored-By: Claude Opus 4.8 (1M context) <noreply@anthropic.com>
</commit_message>
<xml_diff>
--- a/docs/Bilim_OS_КП.docx
+++ b/docs/Bilim_OS_КП.docx
@@ -20,7 +20,7 @@
         <w:rPr>
           <w:b/>
           <w:bCs/>
-          <w:color w:val="E91E8C"/>
+          <w:color w:val="1971C2"/>
           <w:sz w:val="52"/>
           <w:szCs w:val="52"/>
         </w:rPr>
@@ -48,7 +48,7 @@
         <w:rPr>
           <w:b/>
           <w:bCs/>
-          <w:color w:val="E91E8C"/>
+          <w:color w:val="1971C2"/>
           <w:sz w:val="22"/>
           <w:szCs w:val="22"/>
         </w:rPr>
@@ -373,7 +373,7 @@
         <w:rPr>
           <w:b/>
           <w:bCs/>
-          <w:color w:val="E91E8C"/>
+          <w:color w:val="1971C2"/>
           <w:sz w:val="22"/>
           <w:szCs w:val="22"/>
         </w:rPr>
@@ -401,7 +401,7 @@
         <w:rPr>
           <w:b/>
           <w:bCs/>
-          <w:color w:val="E91E8C"/>
+          <w:color w:val="1971C2"/>
           <w:sz w:val="22"/>
           <w:szCs w:val="22"/>
         </w:rPr>
@@ -521,10 +521,10 @@
         </w:rPr>
         <w:t xml:space="preserve">Демо-доступ: </w:t>
       </w:r>
-      <w:hyperlink w:history="1" r:id="rIdyhbfe2hopdudjijlgmxhx">
+      <w:hyperlink w:history="1" r:id="rIduejb-qdukhdvi_1azwh7w">
         <w:r>
           <w:rPr>
-            <w:color w:val="E91E8C"/>
+            <w:color w:val="1971C2"/>
             <w:sz w:val="22"/>
             <w:szCs w:val="22"/>
             <w:u w:val="single"/>
@@ -544,7 +544,7 @@
         <w:rPr>
           <w:b/>
           <w:bCs/>
-          <w:color w:val="E91E8C"/>
+          <w:color w:val="1971C2"/>
           <w:sz w:val="22"/>
           <w:szCs w:val="22"/>
         </w:rPr>

</xml_diff>